<commit_message>
Initial commit: iMovies MERN booking system
</commit_message>
<xml_diff>
--- a/docs/iMovies_Project_Documentation.docx
+++ b/docs/iMovies_Project_Documentation.docx
@@ -5177,7 +5177,23 @@
           <w:sz w:val="24"/>
           <w:szCs w:val="24"/>
         </w:rPr>
-        <w:t>git clone &lt;your-repository-url&gt;</w:t>
+        <w:t>git clone &lt;</w:t>
+      </w:r>
+      <w:r>
+        <w:rPr>
+          <w:rFonts w:ascii="Consolas" w:eastAsia="Consolas" w:hAnsi="Consolas" w:cs="Consolas"/>
+          <w:sz w:val="24"/>
+          <w:szCs w:val="24"/>
+        </w:rPr>
+        <w:t>https://github.com/harshita-singh1600/imovies-movie-booking</w:t>
+      </w:r>
+      <w:r>
+        <w:rPr>
+          <w:rFonts w:ascii="Consolas" w:eastAsia="Consolas" w:hAnsi="Consolas" w:cs="Consolas"/>
+          <w:sz w:val="24"/>
+          <w:szCs w:val="24"/>
+        </w:rPr>
+        <w:t>&gt;</w:t>
       </w:r>
     </w:p>
     <w:p>
@@ -18087,83 +18103,6 @@
         <w:t>Demo</w:t>
       </w:r>
     </w:p>
-    <w:tbl>
-      <w:tblPr>
-        <w:tblW w:w="9026" w:type="dxa"/>
-        <w:tblBorders>
-          <w:top w:val="single" w:sz="4" w:space="0" w:color="auto"/>
-          <w:left w:val="single" w:sz="4" w:space="0" w:color="auto"/>
-          <w:bottom w:val="single" w:sz="4" w:space="0" w:color="auto"/>
-          <w:right w:val="single" w:sz="4" w:space="0" w:color="auto"/>
-          <w:insideH w:val="single" w:sz="4" w:space="0" w:color="auto"/>
-          <w:insideV w:val="single" w:sz="4" w:space="0" w:color="auto"/>
-        </w:tblBorders>
-        <w:tblCellMar>
-          <w:left w:w="10" w:type="dxa"/>
-          <w:right w:w="10" w:type="dxa"/>
-        </w:tblCellMar>
-        <w:tblLook w:val="04A0" w:firstRow="1" w:lastRow="0" w:firstColumn="1" w:lastColumn="0" w:noHBand="0" w:noVBand="1"/>
-      </w:tblPr>
-      <w:tblGrid>
-        <w:gridCol w:w="9026"/>
-      </w:tblGrid>
-      <w:tr>
-        <w:trPr>
-          <w:trHeight w:val="3600"/>
-        </w:trPr>
-        <w:tc>
-          <w:tcPr>
-            <w:tcW w:w="9026" w:type="dxa"/>
-            <w:tcBorders>
-              <w:top w:val="dashed" w:sz="4" w:space="0" w:color="B8BFC9"/>
-              <w:left w:val="dashed" w:sz="4" w:space="0" w:color="B8BFC9"/>
-              <w:bottom w:val="dashed" w:sz="4" w:space="0" w:color="B8BFC9"/>
-              <w:right w:val="dashed" w:sz="4" w:space="0" w:color="B8BFC9"/>
-            </w:tcBorders>
-            <w:shd w:val="clear" w:color="auto" w:fill="FAFBFC"/>
-            <w:vAlign w:val="center"/>
-          </w:tcPr>
-          <w:p>
-            <w:pPr>
-              <w:jc w:val="center"/>
-              <w:rPr>
-                <w:sz w:val="24"/>
-                <w:szCs w:val="24"/>
-              </w:rPr>
-            </w:pPr>
-            <w:r>
-              <w:rPr>
-                <w:i/>
-                <w:iCs/>
-                <w:color w:val="8A94A3"/>
-                <w:sz w:val="24"/>
-                <w:szCs w:val="24"/>
-              </w:rPr>
-              <w:t>[ Insert screenshot here ]</w:t>
-            </w:r>
-          </w:p>
-          <w:p>
-            <w:pPr>
-              <w:jc w:val="center"/>
-              <w:rPr>
-                <w:sz w:val="24"/>
-                <w:szCs w:val="24"/>
-              </w:rPr>
-            </w:pPr>
-            <w:r>
-              <w:rPr>
-                <w:color w:val="8A94A3"/>
-                <w:sz w:val="24"/>
-                <w:szCs w:val="24"/>
-              </w:rPr>
-              <w:t>Replace this box with a picture or paste a link</w:t>
-            </w:r>
-            <w:bookmarkStart w:id="0" w:name="_GoBack"/>
-            <w:bookmarkEnd w:id="0"/>
-          </w:p>
-        </w:tc>
-      </w:tr>
-    </w:tbl>
     <w:p>
       <w:pPr>
         <w:spacing w:before="60" w:after="200"/>
@@ -18173,16 +18112,6 @@
           <w:szCs w:val="24"/>
         </w:rPr>
       </w:pPr>
-      <w:r>
-        <w:rPr>
-          <w:i/>
-          <w:iCs/>
-          <w:color w:val="5B6573"/>
-          <w:sz w:val="24"/>
-          <w:szCs w:val="24"/>
-        </w:rPr>
-        <w:t>Figure 11: Demo screenshot / GIF of the full booking flow</w:t>
-      </w:r>
     </w:p>
     <w:tbl>
       <w:tblPr>
@@ -18202,8 +18131,8 @@
         <w:tblLook w:val="04A0" w:firstRow="1" w:lastRow="0" w:firstColumn="1" w:lastColumn="0" w:noHBand="0" w:noVBand="1"/>
       </w:tblPr>
       <w:tblGrid>
-        <w:gridCol w:w="2600"/>
-        <w:gridCol w:w="6426"/>
+        <w:gridCol w:w="1204"/>
+        <w:gridCol w:w="9260"/>
       </w:tblGrid>
       <w:tr>
         <w:trPr>
@@ -18317,7 +18246,7 @@
                 <w:sz w:val="24"/>
                 <w:szCs w:val="24"/>
               </w:rPr>
-              <w:t>Live demo</w:t>
+              <w:t>Demo video</w:t>
             </w:r>
           </w:p>
         </w:tc>
@@ -18350,8 +18279,10 @@
                 <w:sz w:val="24"/>
                 <w:szCs w:val="24"/>
               </w:rPr>
-              <w:t>[Paste deployed URL here]</w:t>
-            </w:r>
+              <w:t>https://drive.google.com/drive/folders/1gskg_JlwGnd2ZKt3qDrE9Y_mKk3f_1en?usp=sharing</w:t>
+            </w:r>
+            <w:bookmarkStart w:id="0" w:name="_GoBack"/>
+            <w:bookmarkEnd w:id="0"/>
           </w:p>
         </w:tc>
       </w:tr>
@@ -18388,7 +18319,7 @@
                 <w:sz w:val="24"/>
                 <w:szCs w:val="24"/>
               </w:rPr>
-              <w:t>Demo video</w:t>
+              <w:t>GitHub repository</w:t>
             </w:r>
           </w:p>
         </w:tc>
@@ -18421,78 +18352,7 @@
                 <w:sz w:val="24"/>
                 <w:szCs w:val="24"/>
               </w:rPr>
-              <w:t>[Paste video link here]</w:t>
-            </w:r>
-          </w:p>
-        </w:tc>
-      </w:tr>
-      <w:tr>
-        <w:trPr>
-          <w:cantSplit/>
-        </w:trPr>
-        <w:tc>
-          <w:tcPr>
-            <w:tcW w:w="2600" w:type="dxa"/>
-            <w:tcBorders>
-              <w:top w:val="single" w:sz="4" w:space="0" w:color="B8BFC9"/>
-              <w:left w:val="single" w:sz="4" w:space="0" w:color="B8BFC9"/>
-              <w:bottom w:val="single" w:sz="4" w:space="0" w:color="B8BFC9"/>
-              <w:right w:val="single" w:sz="4" w:space="0" w:color="B8BFC9"/>
-            </w:tcBorders>
-            <w:tcMar>
-              <w:top w:w="70" w:type="dxa"/>
-              <w:left w:w="100" w:type="dxa"/>
-              <w:bottom w:w="70" w:type="dxa"/>
-              <w:right w:w="100" w:type="dxa"/>
-            </w:tcMar>
-          </w:tcPr>
-          <w:p>
-            <w:pPr>
-              <w:spacing w:after="20"/>
-              <w:rPr>
-                <w:sz w:val="24"/>
-                <w:szCs w:val="24"/>
-              </w:rPr>
-            </w:pPr>
-            <w:r>
-              <w:rPr>
-                <w:sz w:val="24"/>
-                <w:szCs w:val="24"/>
-              </w:rPr>
-              <w:t>GitHub repository</w:t>
-            </w:r>
-          </w:p>
-        </w:tc>
-        <w:tc>
-          <w:tcPr>
-            <w:tcW w:w="6426" w:type="dxa"/>
-            <w:tcBorders>
-              <w:top w:val="single" w:sz="4" w:space="0" w:color="B8BFC9"/>
-              <w:left w:val="single" w:sz="4" w:space="0" w:color="B8BFC9"/>
-              <w:bottom w:val="single" w:sz="4" w:space="0" w:color="B8BFC9"/>
-              <w:right w:val="single" w:sz="4" w:space="0" w:color="B8BFC9"/>
-            </w:tcBorders>
-            <w:tcMar>
-              <w:top w:w="70" w:type="dxa"/>
-              <w:left w:w="100" w:type="dxa"/>
-              <w:bottom w:w="70" w:type="dxa"/>
-              <w:right w:w="100" w:type="dxa"/>
-            </w:tcMar>
-          </w:tcPr>
-          <w:p>
-            <w:pPr>
-              <w:spacing w:after="20"/>
-              <w:rPr>
-                <w:sz w:val="24"/>
-                <w:szCs w:val="24"/>
-              </w:rPr>
-            </w:pPr>
-            <w:r>
-              <w:rPr>
-                <w:sz w:val="24"/>
-                <w:szCs w:val="24"/>
-              </w:rPr>
-              <w:t>[Paste repository URL here]</w:t>
+              <w:t>https://github.com/harshita-singh1600/imovies-movie-booking</w:t>
             </w:r>
           </w:p>
         </w:tc>
@@ -18512,7 +18372,6 @@
         <w:pStyle w:val="Heading1"/>
       </w:pPr>
       <w:r>
-        <w:lastRenderedPageBreak/>
         <w:t>12. Known Issues</w:t>
       </w:r>
     </w:p>
@@ -19103,6 +18962,7 @@
                 <w:sz w:val="24"/>
                 <w:szCs w:val="24"/>
               </w:rPr>
+              <w:lastRenderedPageBreak/>
               <w:t>The JWT is stored in localStorage, which is exposed if the site has an XSS flaw.</w:t>
             </w:r>
           </w:p>
@@ -19912,7 +19772,6 @@
           <w:sz w:val="24"/>
           <w:szCs w:val="24"/>
         </w:rPr>
-        <w:lastRenderedPageBreak/>
         <w:t xml:space="preserve">Seat map editor: </w:t>
       </w:r>
       <w:r>
@@ -20149,7 +20008,7 @@
         <w:sz w:val="18"/>
         <w:szCs w:val="18"/>
       </w:rPr>
-      <w:t>20</w:t>
+      <w:t>18</w:t>
     </w:r>
     <w:r>
       <w:rPr>

</xml_diff>